<commit_message>
Update technical report to final version
</commit_message>
<xml_diff>
--- a/docs/Fatigue_Recognition_Report.docx
+++ b/docs/Fatigue_Recognition_Report.docx
@@ -636,12 +636,12 @@
             <wp:inline distB="19050" distT="19050" distL="19050" distR="19050">
               <wp:extent cx="2184400" cy="393700"/>
               <wp:effectExtent b="0" l="0" r="0" t="0"/>
-              <wp:docPr id="13" name="image6.png"/>
+              <wp:docPr id="13" name="image1.png"/>
               <a:graphic>
                 <a:graphicData uri="http://schemas.openxmlformats.org/drawingml/2006/picture">
                   <pic:pic>
                     <pic:nvPicPr>
-                      <pic:cNvPr id="0" name="image6.png"/>
+                      <pic:cNvPr id="0" name="image1.png"/>
                       <pic:cNvPicPr preferRelativeResize="0"/>
                     </pic:nvPicPr>
                     <pic:blipFill>
@@ -781,12 +781,12 @@
             <wp:inline distB="19050" distT="19050" distL="19050" distR="19050">
               <wp:extent cx="2501900" cy="406400"/>
               <wp:effectExtent b="0" l="0" r="0" t="0"/>
-              <wp:docPr id="5" name="image1.png"/>
+              <wp:docPr id="5" name="image3.png"/>
               <a:graphic>
                 <a:graphicData uri="http://schemas.openxmlformats.org/drawingml/2006/picture">
                   <pic:pic>
                     <pic:nvPicPr>
-                      <pic:cNvPr id="0" name="image1.png"/>
+                      <pic:cNvPr id="0" name="image3.png"/>
                       <pic:cNvPicPr preferRelativeResize="0"/>
                     </pic:nvPicPr>
                     <pic:blipFill>
@@ -887,12 +887,12 @@
             <wp:inline distB="19050" distT="19050" distL="19050" distR="19050">
               <wp:extent cx="2628900" cy="165100"/>
               <wp:effectExtent b="0" l="0" r="0" t="0"/>
-              <wp:docPr id="16" name="image4.png"/>
+              <wp:docPr id="16" name="image2.png"/>
               <a:graphic>
                 <a:graphicData uri="http://schemas.openxmlformats.org/drawingml/2006/picture">
                   <pic:pic>
                     <pic:nvPicPr>
-                      <pic:cNvPr id="0" name="image4.png"/>
+                      <pic:cNvPr id="0" name="image2.png"/>
                       <pic:cNvPicPr preferRelativeResize="0"/>
                     </pic:nvPicPr>
                     <pic:blipFill>
@@ -943,12 +943,12 @@
             <wp:inline distB="19050" distT="19050" distL="19050" distR="19050">
               <wp:extent cx="4038600" cy="165100"/>
               <wp:effectExtent b="0" l="0" r="0" t="0"/>
-              <wp:docPr id="4" name="image10.png"/>
+              <wp:docPr id="4" name="image9.png"/>
               <a:graphic>
                 <a:graphicData uri="http://schemas.openxmlformats.org/drawingml/2006/picture">
                   <pic:pic>
                     <pic:nvPicPr>
-                      <pic:cNvPr id="0" name="image10.png"/>
+                      <pic:cNvPr id="0" name="image9.png"/>
                       <pic:cNvPicPr preferRelativeResize="0"/>
                     </pic:nvPicPr>
                     <pic:blipFill>
@@ -1197,12 +1197,12 @@
             <wp:inline distB="19050" distT="19050" distL="19050" distR="19050">
               <wp:extent cx="3657600" cy="190500"/>
               <wp:effectExtent b="0" l="0" r="0" t="0"/>
-              <wp:docPr id="9" name="image13.png"/>
+              <wp:docPr id="9" name="image12.png"/>
               <a:graphic>
                 <a:graphicData uri="http://schemas.openxmlformats.org/drawingml/2006/picture">
                   <pic:pic>
                     <pic:nvPicPr>
-                      <pic:cNvPr id="0" name="image13.png"/>
+                      <pic:cNvPr id="0" name="image12.png"/>
                       <pic:cNvPicPr preferRelativeResize="0"/>
                     </pic:nvPicPr>
                     <pic:blipFill>
@@ -1272,12 +1272,12 @@
             <wp:inline distB="19050" distT="19050" distL="19050" distR="19050">
               <wp:extent cx="2514600" cy="406400"/>
               <wp:effectExtent b="0" l="0" r="0" t="0"/>
-              <wp:docPr id="12" name="image2.png"/>
+              <wp:docPr id="12" name="image4.png"/>
               <a:graphic>
                 <a:graphicData uri="http://schemas.openxmlformats.org/drawingml/2006/picture">
                   <pic:pic>
                     <pic:nvPicPr>
-                      <pic:cNvPr id="0" name="image2.png"/>
+                      <pic:cNvPr id="0" name="image4.png"/>
                       <pic:cNvPicPr preferRelativeResize="0"/>
                     </pic:nvPicPr>
                     <pic:blipFill>
@@ -1384,12 +1384,12 @@
             <wp:inline distB="19050" distT="19050" distL="19050" distR="19050">
               <wp:extent cx="2032000" cy="406400"/>
               <wp:effectExtent b="0" l="0" r="0" t="0"/>
-              <wp:docPr id="10" name="image12.png"/>
+              <wp:docPr id="10" name="image5.png"/>
               <a:graphic>
                 <a:graphicData uri="http://schemas.openxmlformats.org/drawingml/2006/picture">
                   <pic:pic>
                     <pic:nvPicPr>
-                      <pic:cNvPr id="0" name="image12.png"/>
+                      <pic:cNvPr id="0" name="image5.png"/>
                       <pic:cNvPicPr preferRelativeResize="0"/>
                     </pic:nvPicPr>
                     <pic:blipFill>
@@ -1725,12 +1725,12 @@
             <wp:inline distB="19050" distT="19050" distL="19050" distR="19050">
               <wp:extent cx="2781300" cy="355600"/>
               <wp:effectExtent b="0" l="0" r="0" t="0"/>
-              <wp:docPr id="8" name="image5.png"/>
+              <wp:docPr id="8" name="image7.png"/>
               <a:graphic>
                 <a:graphicData uri="http://schemas.openxmlformats.org/drawingml/2006/picture">
                   <pic:pic>
                     <pic:nvPicPr>
-                      <pic:cNvPr id="0" name="image5.png"/>
+                      <pic:cNvPr id="0" name="image7.png"/>
                       <pic:cNvPicPr preferRelativeResize="0"/>
                     </pic:nvPicPr>
                     <pic:blipFill>
@@ -1781,12 +1781,12 @@
             <wp:inline distB="19050" distT="19050" distL="19050" distR="19050">
               <wp:extent cx="2362200" cy="520700"/>
               <wp:effectExtent b="0" l="0" r="0" t="0"/>
-              <wp:docPr id="7" name="image3.png"/>
+              <wp:docPr id="7" name="image6.png"/>
               <a:graphic>
                 <a:graphicData uri="http://schemas.openxmlformats.org/drawingml/2006/picture">
                   <pic:pic>
                     <pic:nvPicPr>
-                      <pic:cNvPr id="0" name="image3.png"/>
+                      <pic:cNvPr id="0" name="image6.png"/>
                       <pic:cNvPicPr preferRelativeResize="0"/>
                     </pic:nvPicPr>
                     <pic:blipFill>
@@ -2214,12 +2214,12 @@
             <wp:inline distB="19050" distT="19050" distL="19050" distR="19050">
               <wp:extent cx="4876800" cy="165100"/>
               <wp:effectExtent b="0" l="0" r="0" t="0"/>
-              <wp:docPr id="14" name="image9.png"/>
+              <wp:docPr id="14" name="image10.png"/>
               <a:graphic>
                 <a:graphicData uri="http://schemas.openxmlformats.org/drawingml/2006/picture">
                   <pic:pic>
                     <pic:nvPicPr>
-                      <pic:cNvPr id="0" name="image9.png"/>
+                      <pic:cNvPr id="0" name="image10.png"/>
                       <pic:cNvPicPr preferRelativeResize="0"/>
                     </pic:nvPicPr>
                     <pic:blipFill>
@@ -2326,12 +2326,12 @@
             <wp:inline distB="19050" distT="19050" distL="19050" distR="19050">
               <wp:extent cx="4267200" cy="165100"/>
               <wp:effectExtent b="0" l="0" r="0" t="0"/>
-              <wp:docPr id="15" name="image11.png"/>
+              <wp:docPr id="15" name="image13.png"/>
               <a:graphic>
                 <a:graphicData uri="http://schemas.openxmlformats.org/drawingml/2006/picture">
                   <pic:pic>
                     <pic:nvPicPr>
-                      <pic:cNvPr id="0" name="image11.png"/>
+                      <pic:cNvPr id="0" name="image13.png"/>
                       <pic:cNvPicPr preferRelativeResize="0"/>
                     </pic:nvPicPr>
                     <pic:blipFill>
@@ -5018,12 +5018,12 @@
           <wp:inline distB="114300" distT="114300" distL="114300" distR="114300">
             <wp:extent cx="3200400" cy="2844800"/>
             <wp:effectExtent b="0" l="0" r="0" t="0"/>
-            <wp:docPr id="3" name="image7.gif"/>
+            <wp:docPr id="3" name="image11.gif"/>
             <a:graphic>
               <a:graphicData uri="http://schemas.openxmlformats.org/drawingml/2006/picture">
                 <pic:pic>
                   <pic:nvPicPr>
-                    <pic:cNvPr id="0" name="image7.gif"/>
+                    <pic:cNvPr id="0" name="image11.gif"/>
                     <pic:cNvPicPr preferRelativeResize="0"/>
                   </pic:nvPicPr>
                   <pic:blipFill>

</xml_diff>

<commit_message>
Add group member contributions section to technical report
</commit_message>
<xml_diff>
--- a/docs/Fatigue_Recognition_Report.docx
+++ b/docs/Fatigue_Recognition_Report.docx
@@ -259,12 +259,12 @@
           <wp:inline distB="114300" distT="114300" distL="114300" distR="114300">
             <wp:extent cx="5486400" cy="4927600"/>
             <wp:effectExtent b="0" l="0" r="0" t="0"/>
-            <wp:docPr id="2" name="image8.gif"/>
+            <wp:docPr id="2" name="image2.gif"/>
             <a:graphic>
               <a:graphicData uri="http://schemas.openxmlformats.org/drawingml/2006/picture">
                 <pic:pic>
                   <pic:nvPicPr>
-                    <pic:cNvPr id="0" name="image8.gif"/>
+                    <pic:cNvPr id="0" name="image2.gif"/>
                     <pic:cNvPicPr preferRelativeResize="0"/>
                   </pic:nvPicPr>
                   <pic:blipFill>
@@ -636,12 +636,12 @@
             <wp:inline distB="19050" distT="19050" distL="19050" distR="19050">
               <wp:extent cx="2184400" cy="393700"/>
               <wp:effectExtent b="0" l="0" r="0" t="0"/>
-              <wp:docPr id="13" name="image1.png"/>
+              <wp:docPr id="13" name="image8.png"/>
               <a:graphic>
                 <a:graphicData uri="http://schemas.openxmlformats.org/drawingml/2006/picture">
                   <pic:pic>
                     <pic:nvPicPr>
-                      <pic:cNvPr id="0" name="image1.png"/>
+                      <pic:cNvPr id="0" name="image8.png"/>
                       <pic:cNvPicPr preferRelativeResize="0"/>
                     </pic:nvPicPr>
                     <pic:blipFill>
@@ -781,12 +781,12 @@
             <wp:inline distB="19050" distT="19050" distL="19050" distR="19050">
               <wp:extent cx="2501900" cy="406400"/>
               <wp:effectExtent b="0" l="0" r="0" t="0"/>
-              <wp:docPr id="5" name="image3.png"/>
+              <wp:docPr id="5" name="image7.png"/>
               <a:graphic>
                 <a:graphicData uri="http://schemas.openxmlformats.org/drawingml/2006/picture">
                   <pic:pic>
                     <pic:nvPicPr>
-                      <pic:cNvPr id="0" name="image3.png"/>
+                      <pic:cNvPr id="0" name="image7.png"/>
                       <pic:cNvPicPr preferRelativeResize="0"/>
                     </pic:nvPicPr>
                     <pic:blipFill>
@@ -887,12 +887,12 @@
             <wp:inline distB="19050" distT="19050" distL="19050" distR="19050">
               <wp:extent cx="2628900" cy="165100"/>
               <wp:effectExtent b="0" l="0" r="0" t="0"/>
-              <wp:docPr id="16" name="image2.png"/>
+              <wp:docPr id="16" name="image6.png"/>
               <a:graphic>
                 <a:graphicData uri="http://schemas.openxmlformats.org/drawingml/2006/picture">
                   <pic:pic>
                     <pic:nvPicPr>
-                      <pic:cNvPr id="0" name="image2.png"/>
+                      <pic:cNvPr id="0" name="image6.png"/>
                       <pic:cNvPicPr preferRelativeResize="0"/>
                     </pic:nvPicPr>
                     <pic:blipFill>
@@ -943,12 +943,12 @@
             <wp:inline distB="19050" distT="19050" distL="19050" distR="19050">
               <wp:extent cx="4038600" cy="165100"/>
               <wp:effectExtent b="0" l="0" r="0" t="0"/>
-              <wp:docPr id="4" name="image9.png"/>
+              <wp:docPr id="4" name="image11.png"/>
               <a:graphic>
                 <a:graphicData uri="http://schemas.openxmlformats.org/drawingml/2006/picture">
                   <pic:pic>
                     <pic:nvPicPr>
-                      <pic:cNvPr id="0" name="image9.png"/>
+                      <pic:cNvPr id="0" name="image11.png"/>
                       <pic:cNvPicPr preferRelativeResize="0"/>
                     </pic:nvPicPr>
                     <pic:blipFill>
@@ -1197,12 +1197,12 @@
             <wp:inline distB="19050" distT="19050" distL="19050" distR="19050">
               <wp:extent cx="3657600" cy="190500"/>
               <wp:effectExtent b="0" l="0" r="0" t="0"/>
-              <wp:docPr id="9" name="image12.png"/>
+              <wp:docPr id="9" name="image14.png"/>
               <a:graphic>
                 <a:graphicData uri="http://schemas.openxmlformats.org/drawingml/2006/picture">
                   <pic:pic>
                     <pic:nvPicPr>
-                      <pic:cNvPr id="0" name="image12.png"/>
+                      <pic:cNvPr id="0" name="image14.png"/>
                       <pic:cNvPicPr preferRelativeResize="0"/>
                     </pic:nvPicPr>
                     <pic:blipFill>
@@ -1272,12 +1272,12 @@
             <wp:inline distB="19050" distT="19050" distL="19050" distR="19050">
               <wp:extent cx="2514600" cy="406400"/>
               <wp:effectExtent b="0" l="0" r="0" t="0"/>
-              <wp:docPr id="12" name="image4.png"/>
+              <wp:docPr id="12" name="image9.png"/>
               <a:graphic>
                 <a:graphicData uri="http://schemas.openxmlformats.org/drawingml/2006/picture">
                   <pic:pic>
                     <pic:nvPicPr>
-                      <pic:cNvPr id="0" name="image4.png"/>
+                      <pic:cNvPr id="0" name="image9.png"/>
                       <pic:cNvPicPr preferRelativeResize="0"/>
                     </pic:nvPicPr>
                     <pic:blipFill>
@@ -1384,12 +1384,12 @@
             <wp:inline distB="19050" distT="19050" distL="19050" distR="19050">
               <wp:extent cx="2032000" cy="406400"/>
               <wp:effectExtent b="0" l="0" r="0" t="0"/>
-              <wp:docPr id="10" name="image5.png"/>
+              <wp:docPr id="10" name="image1.png"/>
               <a:graphic>
                 <a:graphicData uri="http://schemas.openxmlformats.org/drawingml/2006/picture">
                   <pic:pic>
                     <pic:nvPicPr>
-                      <pic:cNvPr id="0" name="image5.png"/>
+                      <pic:cNvPr id="0" name="image1.png"/>
                       <pic:cNvPicPr preferRelativeResize="0"/>
                     </pic:nvPicPr>
                     <pic:blipFill>
@@ -1569,12 +1569,12 @@
             <wp:inline distB="19050" distT="19050" distL="19050" distR="19050">
               <wp:extent cx="3606800" cy="215900"/>
               <wp:effectExtent b="0" l="0" r="0" t="0"/>
-              <wp:docPr id="11" name="image14.png"/>
+              <wp:docPr id="11" name="image13.png"/>
               <a:graphic>
                 <a:graphicData uri="http://schemas.openxmlformats.org/drawingml/2006/picture">
                   <pic:pic>
                     <pic:nvPicPr>
-                      <pic:cNvPr id="0" name="image14.png"/>
+                      <pic:cNvPr id="0" name="image13.png"/>
                       <pic:cNvPicPr preferRelativeResize="0"/>
                     </pic:nvPicPr>
                     <pic:blipFill>
@@ -1725,12 +1725,12 @@
             <wp:inline distB="19050" distT="19050" distL="19050" distR="19050">
               <wp:extent cx="2781300" cy="355600"/>
               <wp:effectExtent b="0" l="0" r="0" t="0"/>
-              <wp:docPr id="8" name="image7.png"/>
+              <wp:docPr id="8" name="image5.png"/>
               <a:graphic>
                 <a:graphicData uri="http://schemas.openxmlformats.org/drawingml/2006/picture">
                   <pic:pic>
                     <pic:nvPicPr>
-                      <pic:cNvPr id="0" name="image7.png"/>
+                      <pic:cNvPr id="0" name="image5.png"/>
                       <pic:cNvPicPr preferRelativeResize="0"/>
                     </pic:nvPicPr>
                     <pic:blipFill>
@@ -1781,12 +1781,12 @@
             <wp:inline distB="19050" distT="19050" distL="19050" distR="19050">
               <wp:extent cx="2362200" cy="520700"/>
               <wp:effectExtent b="0" l="0" r="0" t="0"/>
-              <wp:docPr id="7" name="image6.png"/>
+              <wp:docPr id="7" name="image4.png"/>
               <a:graphic>
                 <a:graphicData uri="http://schemas.openxmlformats.org/drawingml/2006/picture">
                   <pic:pic>
                     <pic:nvPicPr>
-                      <pic:cNvPr id="0" name="image6.png"/>
+                      <pic:cNvPr id="0" name="image4.png"/>
                       <pic:cNvPicPr preferRelativeResize="0"/>
                     </pic:nvPicPr>
                     <pic:blipFill>
@@ -2214,12 +2214,12 @@
             <wp:inline distB="19050" distT="19050" distL="19050" distR="19050">
               <wp:extent cx="4876800" cy="165100"/>
               <wp:effectExtent b="0" l="0" r="0" t="0"/>
-              <wp:docPr id="14" name="image10.png"/>
+              <wp:docPr id="14" name="image12.png"/>
               <a:graphic>
                 <a:graphicData uri="http://schemas.openxmlformats.org/drawingml/2006/picture">
                   <pic:pic>
                     <pic:nvPicPr>
-                      <pic:cNvPr id="0" name="image10.png"/>
+                      <pic:cNvPr id="0" name="image12.png"/>
                       <pic:cNvPicPr preferRelativeResize="0"/>
                     </pic:nvPicPr>
                     <pic:blipFill>
@@ -2326,12 +2326,12 @@
             <wp:inline distB="19050" distT="19050" distL="19050" distR="19050">
               <wp:extent cx="4267200" cy="165100"/>
               <wp:effectExtent b="0" l="0" r="0" t="0"/>
-              <wp:docPr id="15" name="image13.png"/>
+              <wp:docPr id="15" name="image10.png"/>
               <a:graphic>
                 <a:graphicData uri="http://schemas.openxmlformats.org/drawingml/2006/picture">
                   <pic:pic>
                     <pic:nvPicPr>
-                      <pic:cNvPr id="0" name="image13.png"/>
+                      <pic:cNvPr id="0" name="image10.png"/>
                       <pic:cNvPicPr preferRelativeResize="0"/>
                     </pic:nvPicPr>
                     <pic:blipFill>
@@ -5018,12 +5018,12 @@
           <wp:inline distB="114300" distT="114300" distL="114300" distR="114300">
             <wp:extent cx="3200400" cy="2844800"/>
             <wp:effectExtent b="0" l="0" r="0" t="0"/>
-            <wp:docPr id="3" name="image11.gif"/>
+            <wp:docPr id="3" name="image3.gif"/>
             <a:graphic>
               <a:graphicData uri="http://schemas.openxmlformats.org/drawingml/2006/picture">
                 <pic:pic>
                   <pic:nvPicPr>
-                    <pic:cNvPr id="0" name="image11.gif"/>
+                    <pic:cNvPr id="0" name="image3.gif"/>
                     <pic:cNvPicPr preferRelativeResize="0"/>
                   </pic:nvPicPr>
                   <pic:blipFill>
@@ -5740,16 +5740,14 @@
     <w:p>
       <w:pPr>
         <w:pStyle w:val="Heading1"/>
-        <w:keepNext w:val="0"/>
-        <w:keepLines w:val="0"/>
-        <w:spacing w:before="480" w:lineRule="auto"/>
+        <w:spacing w:after="60" w:before="40" w:line="300" w:lineRule="auto"/>
         <w:rPr>
           <w:rFonts w:ascii="Times New Roman" w:cs="Times New Roman" w:eastAsia="Times New Roman" w:hAnsi="Times New Roman"/>
           <w:sz w:val="46"/>
           <w:szCs w:val="46"/>
         </w:rPr>
       </w:pPr>
-      <w:bookmarkStart w:colFirst="0" w:colLast="0" w:name="_mymfgrji5qby" w:id="19"/>
+      <w:bookmarkStart w:colFirst="0" w:colLast="0" w:name="_57ilfgkejn8b" w:id="19"/>
       <w:bookmarkEnd w:id="19"/>
       <w:r>
         <w:rPr>
@@ -5758,127 +5756,127 @@
           <w:szCs w:val="46"/>
           <w:rtl w:val="0"/>
         </w:rPr>
-        <w:t xml:space="preserve">References</w:t>
-      </w:r>
-    </w:p>
-    <w:p>
-      <w:pPr>
-        <w:spacing w:after="80" w:before="40" w:line="278.4" w:lineRule="auto"/>
-        <w:ind w:left="1120" w:hanging="560"/>
-        <w:rPr>
-          <w:rFonts w:ascii="Times New Roman" w:cs="Times New Roman" w:eastAsia="Times New Roman" w:hAnsi="Times New Roman"/>
-          <w:sz w:val="24"/>
-          <w:szCs w:val="24"/>
-        </w:rPr>
-      </w:pPr>
-      <w:r>
-        <w:rPr>
-          <w:rFonts w:ascii="Times New Roman" w:cs="Times New Roman" w:eastAsia="Times New Roman" w:hAnsi="Times New Roman"/>
-          <w:sz w:val="24"/>
-          <w:szCs w:val="24"/>
-          <w:rtl w:val="0"/>
-        </w:rPr>
-        <w:t xml:space="preserve">[1] Soukupová, T., &amp; Čech, J. (2016). Real-Time Eye Blink Detection using Facial Landmarks. In Proceedings of the 21st Computer Vision Winter Workshop. (Definition of the Eye Aspect Ratio used in the classical pipeline.)</w:t>
-      </w:r>
-    </w:p>
-    <w:p>
-      <w:pPr>
-        <w:spacing w:after="80" w:before="40" w:line="278.4" w:lineRule="auto"/>
-        <w:ind w:left="1120" w:hanging="560"/>
-        <w:rPr>
-          <w:rFonts w:ascii="Times New Roman" w:cs="Times New Roman" w:eastAsia="Times New Roman" w:hAnsi="Times New Roman"/>
-          <w:sz w:val="24"/>
-          <w:szCs w:val="24"/>
-        </w:rPr>
-      </w:pPr>
-      <w:r>
-        <w:rPr>
-          <w:rFonts w:ascii="Times New Roman" w:cs="Times New Roman" w:eastAsia="Times New Roman" w:hAnsi="Times New Roman"/>
-          <w:sz w:val="24"/>
-          <w:szCs w:val="24"/>
-          <w:rtl w:val="0"/>
-        </w:rPr>
-        <w:t xml:space="preserve">[2] Howard, A., Sandler, M., Chu, G., Chen, L.-C., Chen, B., Tan, M., Wang, W., Zhu, Y., Pang, R., Vasudevan, V., Le, Q. V., &amp; Adam, H. (2019). Searching for MobileNetV3. In Proceedings of the IEEE/CVF International Conference on Computer Vision (ICCV).</w:t>
-      </w:r>
-    </w:p>
-    <w:p>
-      <w:pPr>
-        <w:spacing w:after="80" w:before="40" w:line="278.4" w:lineRule="auto"/>
-        <w:ind w:left="1120" w:hanging="560"/>
-        <w:rPr>
-          <w:rFonts w:ascii="Times New Roman" w:cs="Times New Roman" w:eastAsia="Times New Roman" w:hAnsi="Times New Roman"/>
-          <w:sz w:val="24"/>
-          <w:szCs w:val="24"/>
-        </w:rPr>
-      </w:pPr>
-      <w:r>
-        <w:rPr>
-          <w:rFonts w:ascii="Times New Roman" w:cs="Times New Roman" w:eastAsia="Times New Roman" w:hAnsi="Times New Roman"/>
-          <w:sz w:val="24"/>
-          <w:szCs w:val="24"/>
-          <w:rtl w:val="0"/>
-        </w:rPr>
-        <w:t xml:space="preserve">[3] Lugaresi, C., Tang, J., Nash, H., McClanahan, C., Uboweja, E., Hays, M., Zhang, F., Chang, C.-L., Yong, M. G., Lee, J., Chang, W.-T., Hua, W., Georg, M., &amp; Grundmann, M. (2019). MediaPipe: A Framework for Building Perception Pipelines. arXiv:1906.08172.</w:t>
-      </w:r>
-    </w:p>
-    <w:p>
-      <w:pPr>
-        <w:spacing w:after="80" w:before="40" w:line="278.4" w:lineRule="auto"/>
-        <w:ind w:left="1120" w:hanging="560"/>
-        <w:rPr>
-          <w:rFonts w:ascii="Times New Roman" w:cs="Times New Roman" w:eastAsia="Times New Roman" w:hAnsi="Times New Roman"/>
-          <w:sz w:val="24"/>
-          <w:szCs w:val="24"/>
-        </w:rPr>
-      </w:pPr>
-      <w:r>
-        <w:rPr>
-          <w:rFonts w:ascii="Times New Roman" w:cs="Times New Roman" w:eastAsia="Times New Roman" w:hAnsi="Times New Roman"/>
-          <w:sz w:val="24"/>
-          <w:szCs w:val="24"/>
-          <w:rtl w:val="0"/>
-        </w:rPr>
-        <w:t xml:space="preserve">[4] Bradski, G. (2000). The OpenCV Library. Dr. Dobb’s Journal of Software Tools. (Used for solvePnP-based head pose estimation.)</w:t>
-      </w:r>
-    </w:p>
-    <w:p>
-      <w:pPr>
-        <w:spacing w:after="80" w:before="40" w:line="278.4" w:lineRule="auto"/>
-        <w:ind w:left="1120" w:hanging="560"/>
-        <w:rPr>
-          <w:rFonts w:ascii="Times New Roman" w:cs="Times New Roman" w:eastAsia="Times New Roman" w:hAnsi="Times New Roman"/>
-          <w:sz w:val="24"/>
-          <w:szCs w:val="24"/>
-        </w:rPr>
-      </w:pPr>
-      <w:r>
-        <w:rPr>
-          <w:rFonts w:ascii="Times New Roman" w:cs="Times New Roman" w:eastAsia="Times New Roman" w:hAnsi="Times New Roman"/>
-          <w:sz w:val="24"/>
-          <w:szCs w:val="24"/>
-          <w:rtl w:val="0"/>
-        </w:rPr>
-        <w:t xml:space="preserve">[5] Paszke, A., Gross, S., Massa, F., Lerer, A., Bradbury, J., Chanan, G., Killeen, T., Lin, Z., Gimelshein, N., Antiga, L., Desmaison, A., Köpf, A., Yang, E., DeVito, Z., Raison, M., Tejani, A., Chilamkurthy, S., Steiner, B., Fang, L., Bai, J., &amp; Chintala, S. (2019). PyTorch: An Imperative Style, High-Performance Deep Learning Library. In Advances in Neural Information Processing Systems 32 (NeurIPS).</w:t>
-      </w:r>
-    </w:p>
-    <w:p>
-      <w:pPr>
-        <w:spacing w:after="80" w:before="40" w:line="278.4" w:lineRule="auto"/>
-        <w:ind w:left="1120" w:hanging="560"/>
-        <w:rPr>
-          <w:rFonts w:ascii="Times New Roman" w:cs="Times New Roman" w:eastAsia="Times New Roman" w:hAnsi="Times New Roman"/>
-          <w:sz w:val="24"/>
-          <w:szCs w:val="24"/>
-        </w:rPr>
-      </w:pPr>
-      <w:r>
-        <w:rPr>
-          <w:rFonts w:ascii="Times New Roman" w:cs="Times New Roman" w:eastAsia="Times New Roman" w:hAnsi="Times New Roman"/>
-          <w:sz w:val="24"/>
-          <w:szCs w:val="24"/>
-          <w:rtl w:val="0"/>
-        </w:rPr>
-        <w:t xml:space="preserve">[6] Pedregosa, F., Varoquaux, G., Gramfort, A., Michel, V., Thirion, B., Grisel, O., Blondel, M., Prettenhofer, P., Weiss, R., Dubourg, V., Vanderplas, J., Passos, A., Cournapeau, D., Brucher, M., Perrot, M., &amp; Duchesnay, É. (2011). Scikit-learn: Machine Learning in Python. Journal of Machine Learning Research, 12, 2825–2830.</w:t>
+        <w:t xml:space="preserve">Group Member Contributions</w:t>
+      </w:r>
+    </w:p>
+    <w:p>
+      <w:pPr>
+        <w:numPr>
+          <w:ilvl w:val="0"/>
+          <w:numId w:val="1"/>
+        </w:numPr>
+        <w:ind w:left="720" w:hanging="360"/>
+        <w:rPr>
+          <w:rFonts w:ascii="Times New Roman" w:cs="Times New Roman" w:eastAsia="Times New Roman" w:hAnsi="Times New Roman"/>
+          <w:sz w:val="24"/>
+          <w:szCs w:val="24"/>
+          <w:u w:val="none"/>
+        </w:rPr>
+      </w:pPr>
+      <w:r>
+        <w:rPr>
+          <w:rFonts w:ascii="Times New Roman" w:cs="Times New Roman" w:eastAsia="Times New Roman" w:hAnsi="Times New Roman"/>
+          <w:sz w:val="24"/>
+          <w:szCs w:val="24"/>
+          <w:rtl w:val="0"/>
+        </w:rPr>
+        <w:t xml:space="preserve">Sofiia Avetisian: gesture activation system (finite state machine, MediaPipe Hands rule classifier, thumbs-up calibration tool); recorded and edited the demonstration video.</w:t>
+      </w:r>
+    </w:p>
+    <w:p>
+      <w:pPr>
+        <w:numPr>
+          <w:ilvl w:val="0"/>
+          <w:numId w:val="1"/>
+        </w:numPr>
+        <w:ind w:left="720" w:hanging="360"/>
+        <w:rPr>
+          <w:rFonts w:ascii="Times New Roman" w:cs="Times New Roman" w:eastAsia="Times New Roman" w:hAnsi="Times New Roman"/>
+          <w:sz w:val="24"/>
+          <w:szCs w:val="24"/>
+          <w:u w:val="none"/>
+        </w:rPr>
+      </w:pPr>
+      <w:r>
+        <w:rPr>
+          <w:rFonts w:ascii="Times New Roman" w:cs="Times New Roman" w:eastAsia="Times New Roman" w:hAnsi="Times New Roman"/>
+          <w:sz w:val="24"/>
+          <w:szCs w:val="24"/>
+          <w:rtl w:val="0"/>
+        </w:rPr>
+        <w:t xml:space="preserve">Sofiia Boicenco: classical pipeline (EAR, MAR, and initial head-pose feature extraction); modern pipeline (MobileNetV3 training and inference); initial hybrid fusion.</w:t>
+      </w:r>
+    </w:p>
+    <w:p>
+      <w:pPr>
+        <w:numPr>
+          <w:ilvl w:val="0"/>
+          <w:numId w:val="1"/>
+        </w:numPr>
+        <w:ind w:left="720" w:hanging="360"/>
+        <w:rPr>
+          <w:rFonts w:ascii="Times New Roman" w:cs="Times New Roman" w:eastAsia="Times New Roman" w:hAnsi="Times New Roman"/>
+          <w:sz w:val="24"/>
+          <w:szCs w:val="24"/>
+          <w:u w:val="none"/>
+        </w:rPr>
+      </w:pPr>
+      <w:r>
+        <w:rPr>
+          <w:rFonts w:ascii="Times New Roman" w:cs="Times New Roman" w:eastAsia="Times New Roman" w:hAnsi="Times New Roman"/>
+          <w:sz w:val="24"/>
+          <w:szCs w:val="24"/>
+          <w:rtl w:val="0"/>
+        </w:rPr>
+        <w:t xml:space="preserve">Nathaniel Ayoub: pipeline refactor (face-crop inference, solvePnP head pose, scikit-learn classical classifier), modern-model retraining, and alarm-streak debounce.</w:t>
+      </w:r>
+    </w:p>
+    <w:p>
+      <w:pPr>
+        <w:numPr>
+          <w:ilvl w:val="0"/>
+          <w:numId w:val="1"/>
+        </w:numPr>
+        <w:ind w:left="720" w:hanging="360"/>
+        <w:rPr>
+          <w:rFonts w:ascii="Times New Roman" w:cs="Times New Roman" w:eastAsia="Times New Roman" w:hAnsi="Times New Roman"/>
+          <w:sz w:val="24"/>
+          <w:szCs w:val="24"/>
+          <w:u w:val="none"/>
+        </w:rPr>
+      </w:pPr>
+      <w:r>
+        <w:rPr>
+          <w:rFonts w:ascii="Times New Roman" w:cs="Times New Roman" w:eastAsia="Times New Roman" w:hAnsi="Times New Roman"/>
+          <w:sz w:val="24"/>
+          <w:szCs w:val="24"/>
+          <w:rtl w:val="0"/>
+        </w:rPr>
+        <w:t xml:space="preserve">Ronald Nunez: technical report.</w:t>
+      </w:r>
+    </w:p>
+    <w:p>
+      <w:pPr>
+        <w:numPr>
+          <w:ilvl w:val="0"/>
+          <w:numId w:val="1"/>
+        </w:numPr>
+        <w:ind w:left="720" w:hanging="360"/>
+        <w:rPr>
+          <w:rFonts w:ascii="Times New Roman" w:cs="Times New Roman" w:eastAsia="Times New Roman" w:hAnsi="Times New Roman"/>
+          <w:sz w:val="24"/>
+          <w:szCs w:val="24"/>
+          <w:u w:val="none"/>
+        </w:rPr>
+      </w:pPr>
+      <w:r>
+        <w:rPr>
+          <w:rFonts w:ascii="Times New Roman" w:cs="Times New Roman" w:eastAsia="Times New Roman" w:hAnsi="Times New Roman"/>
+          <w:sz w:val="24"/>
+          <w:szCs w:val="24"/>
+          <w:rtl w:val="0"/>
+        </w:rPr>
+        <w:t xml:space="preserve">Thulfiqar Al-Shaheeb: technical report.</w:t>
       </w:r>
     </w:p>
     <w:p>
@@ -5893,8 +5891,152 @@
           <w:szCs w:val="46"/>
         </w:rPr>
       </w:pPr>
-      <w:bookmarkStart w:colFirst="0" w:colLast="0" w:name="_gwqbtd3gqepu" w:id="20"/>
+      <w:bookmarkStart w:colFirst="0" w:colLast="0" w:name="_mymfgrji5qby" w:id="20"/>
       <w:bookmarkEnd w:id="20"/>
+      <w:r>
+        <w:rPr>
+          <w:rFonts w:ascii="Times New Roman" w:cs="Times New Roman" w:eastAsia="Times New Roman" w:hAnsi="Times New Roman"/>
+          <w:sz w:val="46"/>
+          <w:szCs w:val="46"/>
+          <w:rtl w:val="0"/>
+        </w:rPr>
+        <w:t xml:space="preserve">References</w:t>
+      </w:r>
+    </w:p>
+    <w:p>
+      <w:pPr>
+        <w:spacing w:after="80" w:before="40" w:line="278.4" w:lineRule="auto"/>
+        <w:ind w:left="1120" w:hanging="560"/>
+        <w:rPr>
+          <w:rFonts w:ascii="Times New Roman" w:cs="Times New Roman" w:eastAsia="Times New Roman" w:hAnsi="Times New Roman"/>
+          <w:sz w:val="24"/>
+          <w:szCs w:val="24"/>
+        </w:rPr>
+      </w:pPr>
+      <w:r>
+        <w:rPr>
+          <w:rFonts w:ascii="Times New Roman" w:cs="Times New Roman" w:eastAsia="Times New Roman" w:hAnsi="Times New Roman"/>
+          <w:sz w:val="24"/>
+          <w:szCs w:val="24"/>
+          <w:rtl w:val="0"/>
+        </w:rPr>
+        <w:t xml:space="preserve">[1] Soukupová, T., &amp; Čech, J. (2016). Real-Time Eye Blink Detection using Facial Landmarks. In Proceedings of the 21st Computer Vision Winter Workshop. (Definition of the Eye Aspect Ratio used in the classical pipeline.)</w:t>
+      </w:r>
+    </w:p>
+    <w:p>
+      <w:pPr>
+        <w:spacing w:after="80" w:before="40" w:line="278.4" w:lineRule="auto"/>
+        <w:ind w:left="1120" w:hanging="560"/>
+        <w:rPr>
+          <w:rFonts w:ascii="Times New Roman" w:cs="Times New Roman" w:eastAsia="Times New Roman" w:hAnsi="Times New Roman"/>
+          <w:sz w:val="24"/>
+          <w:szCs w:val="24"/>
+        </w:rPr>
+      </w:pPr>
+      <w:r>
+        <w:rPr>
+          <w:rFonts w:ascii="Times New Roman" w:cs="Times New Roman" w:eastAsia="Times New Roman" w:hAnsi="Times New Roman"/>
+          <w:sz w:val="24"/>
+          <w:szCs w:val="24"/>
+          <w:rtl w:val="0"/>
+        </w:rPr>
+        <w:t xml:space="preserve">[2] Howard, A., Sandler, M., Chu, G., Chen, L.-C., Chen, B., Tan, M., Wang, W., Zhu, Y., Pang, R., Vasudevan, V., Le, Q. V., &amp; Adam, H. (2019). Searching for MobileNetV3. In Proceedings of the IEEE/CVF International Conference on Computer Vision (ICCV).</w:t>
+      </w:r>
+    </w:p>
+    <w:p>
+      <w:pPr>
+        <w:spacing w:after="80" w:before="40" w:line="278.4" w:lineRule="auto"/>
+        <w:ind w:left="1120" w:hanging="560"/>
+        <w:rPr>
+          <w:rFonts w:ascii="Times New Roman" w:cs="Times New Roman" w:eastAsia="Times New Roman" w:hAnsi="Times New Roman"/>
+          <w:sz w:val="24"/>
+          <w:szCs w:val="24"/>
+        </w:rPr>
+      </w:pPr>
+      <w:r>
+        <w:rPr>
+          <w:rFonts w:ascii="Times New Roman" w:cs="Times New Roman" w:eastAsia="Times New Roman" w:hAnsi="Times New Roman"/>
+          <w:sz w:val="24"/>
+          <w:szCs w:val="24"/>
+          <w:rtl w:val="0"/>
+        </w:rPr>
+        <w:t xml:space="preserve">[3] Lugaresi, C., Tang, J., Nash, H., McClanahan, C., Uboweja, E., Hays, M., Zhang, F., Chang, C.-L., Yong, M. G., Lee, J., Chang, W.-T., Hua, W., Georg, M., &amp; Grundmann, M. (2019). MediaPipe: A Framework for Building Perception Pipelines. arXiv:1906.08172.</w:t>
+      </w:r>
+    </w:p>
+    <w:p>
+      <w:pPr>
+        <w:spacing w:after="80" w:before="40" w:line="278.4" w:lineRule="auto"/>
+        <w:ind w:left="1120" w:hanging="560"/>
+        <w:rPr>
+          <w:rFonts w:ascii="Times New Roman" w:cs="Times New Roman" w:eastAsia="Times New Roman" w:hAnsi="Times New Roman"/>
+          <w:sz w:val="24"/>
+          <w:szCs w:val="24"/>
+        </w:rPr>
+      </w:pPr>
+      <w:r>
+        <w:rPr>
+          <w:rFonts w:ascii="Times New Roman" w:cs="Times New Roman" w:eastAsia="Times New Roman" w:hAnsi="Times New Roman"/>
+          <w:sz w:val="24"/>
+          <w:szCs w:val="24"/>
+          <w:rtl w:val="0"/>
+        </w:rPr>
+        <w:t xml:space="preserve">[4] Bradski, G. (2000). The OpenCV Library. Dr. Dobb’s Journal of Software Tools. (Used for solvePnP-based head pose estimation.)</w:t>
+      </w:r>
+    </w:p>
+    <w:p>
+      <w:pPr>
+        <w:spacing w:after="80" w:before="40" w:line="278.4" w:lineRule="auto"/>
+        <w:ind w:left="1120" w:hanging="560"/>
+        <w:rPr>
+          <w:rFonts w:ascii="Times New Roman" w:cs="Times New Roman" w:eastAsia="Times New Roman" w:hAnsi="Times New Roman"/>
+          <w:sz w:val="24"/>
+          <w:szCs w:val="24"/>
+        </w:rPr>
+      </w:pPr>
+      <w:r>
+        <w:rPr>
+          <w:rFonts w:ascii="Times New Roman" w:cs="Times New Roman" w:eastAsia="Times New Roman" w:hAnsi="Times New Roman"/>
+          <w:sz w:val="24"/>
+          <w:szCs w:val="24"/>
+          <w:rtl w:val="0"/>
+        </w:rPr>
+        <w:t xml:space="preserve">[5] Paszke, A., Gross, S., Massa, F., Lerer, A., Bradbury, J., Chanan, G., Killeen, T., Lin, Z., Gimelshein, N., Antiga, L., Desmaison, A., Köpf, A., Yang, E., DeVito, Z., Raison, M., Tejani, A., Chilamkurthy, S., Steiner, B., Fang, L., Bai, J., &amp; Chintala, S. (2019). PyTorch: An Imperative Style, High-Performance Deep Learning Library. In Advances in Neural Information Processing Systems 32 (NeurIPS).</w:t>
+      </w:r>
+    </w:p>
+    <w:p>
+      <w:pPr>
+        <w:spacing w:after="80" w:before="40" w:line="278.4" w:lineRule="auto"/>
+        <w:ind w:left="1120" w:hanging="560"/>
+        <w:rPr>
+          <w:rFonts w:ascii="Times New Roman" w:cs="Times New Roman" w:eastAsia="Times New Roman" w:hAnsi="Times New Roman"/>
+          <w:sz w:val="24"/>
+          <w:szCs w:val="24"/>
+        </w:rPr>
+      </w:pPr>
+      <w:r>
+        <w:rPr>
+          <w:rFonts w:ascii="Times New Roman" w:cs="Times New Roman" w:eastAsia="Times New Roman" w:hAnsi="Times New Roman"/>
+          <w:sz w:val="24"/>
+          <w:szCs w:val="24"/>
+          <w:rtl w:val="0"/>
+        </w:rPr>
+        <w:t xml:space="preserve">[6] Pedregosa, F., Varoquaux, G., Gramfort, A., Michel, V., Thirion, B., Grisel, O., Blondel, M., Prettenhofer, P., Weiss, R., Dubourg, V., Vanderplas, J., Passos, A., Cournapeau, D., Brucher, M., Perrot, M., &amp; Duchesnay, É. (2011). Scikit-learn: Machine Learning in Python. Journal of Machine Learning Research, 12, 2825–2830.</w:t>
+      </w:r>
+    </w:p>
+    <w:p>
+      <w:pPr>
+        <w:pStyle w:val="Heading1"/>
+        <w:keepNext w:val="0"/>
+        <w:keepLines w:val="0"/>
+        <w:spacing w:before="480" w:lineRule="auto"/>
+        <w:rPr>
+          <w:rFonts w:ascii="Times New Roman" w:cs="Times New Roman" w:eastAsia="Times New Roman" w:hAnsi="Times New Roman"/>
+          <w:sz w:val="46"/>
+          <w:szCs w:val="46"/>
+        </w:rPr>
+      </w:pPr>
+      <w:bookmarkStart w:colFirst="0" w:colLast="0" w:name="_gwqbtd3gqepu" w:id="21"/>
+      <w:bookmarkEnd w:id="21"/>
       <w:r>
         <w:rPr>
           <w:rFonts w:ascii="Times New Roman" w:cs="Times New Roman" w:eastAsia="Times New Roman" w:hAnsi="Times New Roman"/>
@@ -6297,7 +6439,121 @@
 </file>
 
 <file path=word/numbering.xml><?xml version="1.0" encoding="utf-8"?>
-<w:numbering xmlns:mc="http://schemas.openxmlformats.org/markup-compatibility/2006" xmlns:o="urn:schemas-microsoft-com:office:office" xmlns:r="http://schemas.openxmlformats.org/officeDocument/2006/relationships" xmlns:m="http://schemas.openxmlformats.org/officeDocument/2006/math" xmlns:v="urn:schemas-microsoft-com:vml" xmlns:wp="http://schemas.openxmlformats.org/drawingml/2006/wordprocessingDrawing" xmlns:w10="urn:schemas-microsoft-com:office:word" xmlns:w="http://schemas.openxmlformats.org/wordprocessingml/2006/main" xmlns:wne="http://schemas.microsoft.com/office/word/2006/wordml" xmlns:sl="http://schemas.openxmlformats.org/schemaLibrary/2006/main" xmlns:a="http://schemas.openxmlformats.org/drawingml/2006/main" xmlns:pic="http://schemas.openxmlformats.org/drawingml/2006/picture" xmlns:c="http://schemas.openxmlformats.org/drawingml/2006/chart" xmlns:lc="http://schemas.openxmlformats.org/drawingml/2006/lockedCanvas" xmlns:dgm="http://schemas.openxmlformats.org/drawingml/2006/diagram" xmlns:wps="http://schemas.microsoft.com/office/word/2010/wordprocessingShape" xmlns:wpg="http://schemas.microsoft.com/office/word/2010/wordprocessingGroup" xmlns:w14="http://schemas.microsoft.com/office/word/2010/wordml" xmlns:w15="http://schemas.microsoft.com/office/word/2012/wordml" xmlns:w16="http://schemas.microsoft.com/office/word/2018/wordml" xmlns:w16cex="http://schemas.microsoft.com/office/word/2018/wordml/cex" xmlns:w16cid="http://schemas.microsoft.com/office/word/2016/wordml/cid" xmlns="http://schemas.microsoft.com/office/tasks/2019/documenttasks" xmlns:cr="http://schemas.microsoft.com/office/comments/2020/reactions"/>
+<w:numbering xmlns:mc="http://schemas.openxmlformats.org/markup-compatibility/2006" xmlns:o="urn:schemas-microsoft-com:office:office" xmlns:r="http://schemas.openxmlformats.org/officeDocument/2006/relationships" xmlns:m="http://schemas.openxmlformats.org/officeDocument/2006/math" xmlns:v="urn:schemas-microsoft-com:vml" xmlns:wp="http://schemas.openxmlformats.org/drawingml/2006/wordprocessingDrawing" xmlns:w10="urn:schemas-microsoft-com:office:word" xmlns:w="http://schemas.openxmlformats.org/wordprocessingml/2006/main" xmlns:wne="http://schemas.microsoft.com/office/word/2006/wordml" xmlns:sl="http://schemas.openxmlformats.org/schemaLibrary/2006/main" xmlns:a="http://schemas.openxmlformats.org/drawingml/2006/main" xmlns:pic="http://schemas.openxmlformats.org/drawingml/2006/picture" xmlns:c="http://schemas.openxmlformats.org/drawingml/2006/chart" xmlns:lc="http://schemas.openxmlformats.org/drawingml/2006/lockedCanvas" xmlns:dgm="http://schemas.openxmlformats.org/drawingml/2006/diagram" xmlns:wps="http://schemas.microsoft.com/office/word/2010/wordprocessingShape" xmlns:wpg="http://schemas.microsoft.com/office/word/2010/wordprocessingGroup" xmlns:w14="http://schemas.microsoft.com/office/word/2010/wordml" xmlns:w15="http://schemas.microsoft.com/office/word/2012/wordml" xmlns:w16="http://schemas.microsoft.com/office/word/2018/wordml" xmlns:w16cex="http://schemas.microsoft.com/office/word/2018/wordml/cex" xmlns:w16cid="http://schemas.microsoft.com/office/word/2016/wordml/cid" xmlns="http://schemas.microsoft.com/office/tasks/2019/documenttasks" xmlns:cr="http://schemas.microsoft.com/office/comments/2020/reactions">
+  <w:abstractNum w:abstractNumId="1">
+    <w:lvl w:ilvl="0">
+      <w:start w:val="1"/>
+      <w:numFmt w:val="bullet"/>
+      <w:lvlText w:val="-"/>
+      <w:lvlJc w:val="left"/>
+      <w:pPr>
+        <w:ind w:left="720" w:hanging="360"/>
+      </w:pPr>
+      <w:rPr>
+        <w:u w:val="none"/>
+      </w:rPr>
+    </w:lvl>
+    <w:lvl w:ilvl="1">
+      <w:start w:val="1"/>
+      <w:numFmt w:val="bullet"/>
+      <w:lvlText w:val="-"/>
+      <w:lvlJc w:val="left"/>
+      <w:pPr>
+        <w:ind w:left="1440" w:hanging="360"/>
+      </w:pPr>
+      <w:rPr>
+        <w:u w:val="none"/>
+      </w:rPr>
+    </w:lvl>
+    <w:lvl w:ilvl="2">
+      <w:start w:val="1"/>
+      <w:numFmt w:val="bullet"/>
+      <w:lvlText w:val="-"/>
+      <w:lvlJc w:val="left"/>
+      <w:pPr>
+        <w:ind w:left="2160" w:hanging="360"/>
+      </w:pPr>
+      <w:rPr>
+        <w:u w:val="none"/>
+      </w:rPr>
+    </w:lvl>
+    <w:lvl w:ilvl="3">
+      <w:start w:val="1"/>
+      <w:numFmt w:val="bullet"/>
+      <w:lvlText w:val="-"/>
+      <w:lvlJc w:val="left"/>
+      <w:pPr>
+        <w:ind w:left="2880" w:hanging="360"/>
+      </w:pPr>
+      <w:rPr>
+        <w:u w:val="none"/>
+      </w:rPr>
+    </w:lvl>
+    <w:lvl w:ilvl="4">
+      <w:start w:val="1"/>
+      <w:numFmt w:val="bullet"/>
+      <w:lvlText w:val="-"/>
+      <w:lvlJc w:val="left"/>
+      <w:pPr>
+        <w:ind w:left="3600" w:hanging="360"/>
+      </w:pPr>
+      <w:rPr>
+        <w:u w:val="none"/>
+      </w:rPr>
+    </w:lvl>
+    <w:lvl w:ilvl="5">
+      <w:start w:val="1"/>
+      <w:numFmt w:val="bullet"/>
+      <w:lvlText w:val="-"/>
+      <w:lvlJc w:val="left"/>
+      <w:pPr>
+        <w:ind w:left="4320" w:hanging="360"/>
+      </w:pPr>
+      <w:rPr>
+        <w:u w:val="none"/>
+      </w:rPr>
+    </w:lvl>
+    <w:lvl w:ilvl="6">
+      <w:start w:val="1"/>
+      <w:numFmt w:val="bullet"/>
+      <w:lvlText w:val="-"/>
+      <w:lvlJc w:val="left"/>
+      <w:pPr>
+        <w:ind w:left="5040" w:hanging="360"/>
+      </w:pPr>
+      <w:rPr>
+        <w:u w:val="none"/>
+      </w:rPr>
+    </w:lvl>
+    <w:lvl w:ilvl="7">
+      <w:start w:val="1"/>
+      <w:numFmt w:val="bullet"/>
+      <w:lvlText w:val="-"/>
+      <w:lvlJc w:val="left"/>
+      <w:pPr>
+        <w:ind w:left="5760" w:hanging="360"/>
+      </w:pPr>
+      <w:rPr>
+        <w:u w:val="none"/>
+      </w:rPr>
+    </w:lvl>
+    <w:lvl w:ilvl="8">
+      <w:start w:val="1"/>
+      <w:numFmt w:val="bullet"/>
+      <w:lvlText w:val="-"/>
+      <w:lvlJc w:val="left"/>
+      <w:pPr>
+        <w:ind w:left="6480" w:hanging="360"/>
+      </w:pPr>
+      <w:rPr>
+        <w:u w:val="none"/>
+      </w:rPr>
+    </w:lvl>
+  </w:abstractNum>
+  <w:num w:numId="1">
+    <w:abstractNumId w:val="1"/>
+  </w:num>
+</w:numbering>
 </file>
 
 <file path=word/styles.xml><?xml version="1.0" encoding="utf-8"?>

</xml_diff>